<commit_message>
first minimal python project version
</commit_message>
<xml_diff>
--- a/ai-demo/ReadMe.docx
+++ b/ai-demo/ReadMe.docx
@@ -195,6 +195,1090 @@
         </w:rPr>
       </w:pPr>
     </w:p>
+    <w:p>
+      <w:pPr>
+        <w:rPr>
+          <w:rFonts w:ascii="Menlo" w:hAnsi="Menlo" w:cs="Menlo"/>
+          <w:color w:val="E0E0E0"/>
+          <w:kern w:val="0"/>
+          <w:sz w:val="30"/>
+          <w:szCs w:val="30"/>
+        </w:rPr>
+      </w:pPr>
+      <w:r>
+        <w:rPr>
+          <w:rFonts w:ascii="Menlo" w:hAnsi="Menlo" w:cs="Menlo"/>
+          <w:color w:val="E0E0E0"/>
+          <w:kern w:val="0"/>
+          <w:sz w:val="30"/>
+          <w:szCs w:val="30"/>
+        </w:rPr>
+        <w:t>both commands are same</w:t>
+      </w:r>
+    </w:p>
+    <w:p>
+      <w:pPr>
+        <w:rPr>
+          <w:rFonts w:ascii="Menlo" w:hAnsi="Menlo" w:cs="Menlo"/>
+          <w:color w:val="E0E0E0"/>
+          <w:kern w:val="0"/>
+          <w:sz w:val="30"/>
+          <w:szCs w:val="30"/>
+        </w:rPr>
+      </w:pPr>
+      <w:proofErr w:type="spellStart"/>
+      <w:r>
+        <w:rPr>
+          <w:rFonts w:ascii="Menlo" w:hAnsi="Menlo" w:cs="Menlo"/>
+          <w:color w:val="E0E0E0"/>
+          <w:kern w:val="0"/>
+          <w:sz w:val="30"/>
+          <w:szCs w:val="30"/>
+        </w:rPr>
+        <w:t>ollama</w:t>
+      </w:r>
+      <w:proofErr w:type="spellEnd"/>
+      <w:r>
+        <w:rPr>
+          <w:rFonts w:ascii="Menlo" w:hAnsi="Menlo" w:cs="Menlo"/>
+          <w:color w:val="E0E0E0"/>
+          <w:kern w:val="0"/>
+          <w:sz w:val="30"/>
+          <w:szCs w:val="30"/>
+        </w:rPr>
+        <w:t xml:space="preserve"> ls</w:t>
+      </w:r>
+      <w:r>
+        <w:rPr>
+          <w:rFonts w:ascii="Menlo" w:hAnsi="Menlo" w:cs="Menlo"/>
+          <w:color w:val="E0E0E0"/>
+          <w:kern w:val="0"/>
+          <w:sz w:val="30"/>
+          <w:szCs w:val="30"/>
+        </w:rPr>
+        <w:t xml:space="preserve"> =</w:t>
+      </w:r>
+      <w:r>
+        <w:rPr>
+          <w:rFonts w:ascii="Menlo" w:hAnsi="Menlo" w:cs="Menlo"/>
+          <w:color w:val="E0E0E0"/>
+          <w:kern w:val="0"/>
+          <w:sz w:val="30"/>
+          <w:szCs w:val="30"/>
+        </w:rPr>
+        <w:t xml:space="preserve"> </w:t>
+      </w:r>
+      <w:proofErr w:type="spellStart"/>
+      <w:r>
+        <w:rPr>
+          <w:rFonts w:ascii="Menlo" w:hAnsi="Menlo" w:cs="Menlo"/>
+          <w:color w:val="E0E0E0"/>
+          <w:kern w:val="0"/>
+          <w:sz w:val="30"/>
+          <w:szCs w:val="30"/>
+        </w:rPr>
+        <w:t>ollama</w:t>
+      </w:r>
+      <w:proofErr w:type="spellEnd"/>
+      <w:r>
+        <w:rPr>
+          <w:rFonts w:ascii="Menlo" w:hAnsi="Menlo" w:cs="Menlo"/>
+          <w:color w:val="E0E0E0"/>
+          <w:kern w:val="0"/>
+          <w:sz w:val="30"/>
+          <w:szCs w:val="30"/>
+        </w:rPr>
+        <w:t xml:space="preserve"> l</w:t>
+      </w:r>
+      <w:r>
+        <w:rPr>
+          <w:rFonts w:ascii="Menlo" w:hAnsi="Menlo" w:cs="Menlo"/>
+          <w:color w:val="E0E0E0"/>
+          <w:kern w:val="0"/>
+          <w:sz w:val="30"/>
+          <w:szCs w:val="30"/>
+        </w:rPr>
+        <w:t>ist</w:t>
+      </w:r>
+    </w:p>
+    <w:p>
+      <w:pPr>
+        <w:rPr>
+          <w:rFonts w:ascii="Menlo" w:hAnsi="Menlo" w:cs="Menlo"/>
+          <w:color w:val="E0E0E0"/>
+          <w:kern w:val="0"/>
+          <w:sz w:val="30"/>
+          <w:szCs w:val="30"/>
+        </w:rPr>
+      </w:pPr>
+    </w:p>
+    <w:p>
+      <w:pPr>
+        <w:rPr>
+          <w:rFonts w:ascii="Menlo" w:hAnsi="Menlo" w:cs="Menlo"/>
+          <w:color w:val="E0E0E0"/>
+          <w:kern w:val="0"/>
+          <w:sz w:val="30"/>
+          <w:szCs w:val="30"/>
+        </w:rPr>
+      </w:pPr>
+      <w:r>
+        <w:rPr>
+          <w:rFonts w:ascii="Menlo" w:hAnsi="Menlo" w:cs="Menlo"/>
+          <w:color w:val="E0E0E0"/>
+          <w:kern w:val="0"/>
+          <w:sz w:val="30"/>
+          <w:szCs w:val="30"/>
+        </w:rPr>
+        <w:t>to pull a new version to your local machine, run following command</w:t>
+      </w:r>
+    </w:p>
+    <w:p>
+      <w:pPr>
+        <w:rPr>
+          <w:rFonts w:ascii="Menlo" w:hAnsi="Menlo" w:cs="Menlo"/>
+          <w:color w:val="E0E0E0"/>
+          <w:kern w:val="0"/>
+          <w:sz w:val="30"/>
+          <w:szCs w:val="30"/>
+        </w:rPr>
+      </w:pPr>
+      <w:proofErr w:type="spellStart"/>
+      <w:r>
+        <w:rPr>
+          <w:rFonts w:ascii="Menlo" w:hAnsi="Menlo" w:cs="Menlo"/>
+          <w:color w:val="E0E0E0"/>
+          <w:kern w:val="0"/>
+          <w:sz w:val="30"/>
+          <w:szCs w:val="30"/>
+        </w:rPr>
+        <w:t>ollama</w:t>
+      </w:r>
+      <w:proofErr w:type="spellEnd"/>
+      <w:r>
+        <w:rPr>
+          <w:rFonts w:ascii="Menlo" w:hAnsi="Menlo" w:cs="Menlo"/>
+          <w:color w:val="E0E0E0"/>
+          <w:kern w:val="0"/>
+          <w:sz w:val="30"/>
+          <w:szCs w:val="30"/>
+        </w:rPr>
+        <w:t xml:space="preserve"> pull &lt;</w:t>
+      </w:r>
+      <w:proofErr w:type="spellStart"/>
+      <w:r>
+        <w:rPr>
+          <w:rFonts w:ascii="Menlo" w:hAnsi="Menlo" w:cs="Menlo"/>
+          <w:color w:val="E0E0E0"/>
+          <w:kern w:val="0"/>
+          <w:sz w:val="30"/>
+          <w:szCs w:val="30"/>
+        </w:rPr>
+        <w:t>model_name_or_version</w:t>
+      </w:r>
+      <w:proofErr w:type="spellEnd"/>
+      <w:r>
+        <w:rPr>
+          <w:rFonts w:ascii="Menlo" w:hAnsi="Menlo" w:cs="Menlo"/>
+          <w:color w:val="E0E0E0"/>
+          <w:kern w:val="0"/>
+          <w:sz w:val="30"/>
+          <w:szCs w:val="30"/>
+        </w:rPr>
+        <w:t>&gt;</w:t>
+      </w:r>
+    </w:p>
+    <w:p>
+      <w:pPr>
+        <w:rPr>
+          <w:rFonts w:ascii="Menlo" w:hAnsi="Menlo" w:cs="Menlo"/>
+          <w:color w:val="E0E0E0"/>
+          <w:kern w:val="0"/>
+          <w:sz w:val="30"/>
+          <w:szCs w:val="30"/>
+        </w:rPr>
+      </w:pPr>
+    </w:p>
+    <w:p>
+      <w:pPr>
+        <w:tabs>
+          <w:tab w:val="left" w:pos="560"/>
+          <w:tab w:val="left" w:pos="1120"/>
+          <w:tab w:val="left" w:pos="1680"/>
+          <w:tab w:val="left" w:pos="2240"/>
+          <w:tab w:val="left" w:pos="2800"/>
+          <w:tab w:val="left" w:pos="3360"/>
+          <w:tab w:val="left" w:pos="3920"/>
+          <w:tab w:val="left" w:pos="4480"/>
+          <w:tab w:val="left" w:pos="5040"/>
+          <w:tab w:val="left" w:pos="5600"/>
+          <w:tab w:val="left" w:pos="6160"/>
+          <w:tab w:val="left" w:pos="6720"/>
+        </w:tabs>
+        <w:autoSpaceDE w:val="0"/>
+        <w:autoSpaceDN w:val="0"/>
+        <w:adjustRightInd w:val="0"/>
+        <w:spacing w:after="0" w:line="240" w:lineRule="auto"/>
+        <w:rPr>
+          <w:rFonts w:ascii="Menlo" w:hAnsi="Menlo" w:cs="Menlo"/>
+          <w:color w:val="E0E0E0"/>
+          <w:kern w:val="0"/>
+          <w:sz w:val="30"/>
+          <w:szCs w:val="30"/>
+          <w:lang w:val="sv-SE"/>
+        </w:rPr>
+      </w:pPr>
+      <w:proofErr w:type="spellStart"/>
+      <w:r>
+        <w:rPr>
+          <w:rFonts w:ascii="Menlo" w:hAnsi="Menlo" w:cs="Menlo"/>
+          <w:color w:val="E0E0E0"/>
+          <w:kern w:val="0"/>
+          <w:sz w:val="30"/>
+          <w:szCs w:val="30"/>
+          <w:lang w:val="sv-SE"/>
+        </w:rPr>
+        <w:t>msaxena@Manishs-MacBook-Pro</w:t>
+      </w:r>
+      <w:proofErr w:type="spellEnd"/>
+      <w:r>
+        <w:rPr>
+          <w:rFonts w:ascii="Menlo" w:hAnsi="Menlo" w:cs="Menlo"/>
+          <w:color w:val="E0E0E0"/>
+          <w:kern w:val="0"/>
+          <w:sz w:val="30"/>
+          <w:szCs w:val="30"/>
+          <w:lang w:val="sv-SE"/>
+        </w:rPr>
+        <w:t xml:space="preserve"> </w:t>
+      </w:r>
+      <w:proofErr w:type="spellStart"/>
+      <w:r>
+        <w:rPr>
+          <w:rFonts w:ascii="Menlo" w:hAnsi="Menlo" w:cs="Menlo"/>
+          <w:color w:val="E0E0E0"/>
+          <w:kern w:val="0"/>
+          <w:sz w:val="30"/>
+          <w:szCs w:val="30"/>
+          <w:lang w:val="sv-SE"/>
+        </w:rPr>
+        <w:t>ai</w:t>
+      </w:r>
+      <w:proofErr w:type="spellEnd"/>
+      <w:r>
+        <w:rPr>
+          <w:rFonts w:ascii="Menlo" w:hAnsi="Menlo" w:cs="Menlo"/>
+          <w:color w:val="E0E0E0"/>
+          <w:kern w:val="0"/>
+          <w:sz w:val="30"/>
+          <w:szCs w:val="30"/>
+          <w:lang w:val="sv-SE"/>
+        </w:rPr>
+        <w:t xml:space="preserve">-demo % </w:t>
+      </w:r>
+      <w:proofErr w:type="spellStart"/>
+      <w:r>
+        <w:rPr>
+          <w:rFonts w:ascii="Menlo" w:hAnsi="Menlo" w:cs="Menlo"/>
+          <w:color w:val="E0E0E0"/>
+          <w:kern w:val="0"/>
+          <w:sz w:val="30"/>
+          <w:szCs w:val="30"/>
+          <w:lang w:val="sv-SE"/>
+        </w:rPr>
+        <w:t>ollama</w:t>
+      </w:r>
+      <w:proofErr w:type="spellEnd"/>
+      <w:r>
+        <w:rPr>
+          <w:rFonts w:ascii="Menlo" w:hAnsi="Menlo" w:cs="Menlo"/>
+          <w:color w:val="E0E0E0"/>
+          <w:kern w:val="0"/>
+          <w:sz w:val="30"/>
+          <w:szCs w:val="30"/>
+          <w:lang w:val="sv-SE"/>
+        </w:rPr>
+        <w:t xml:space="preserve"> --version</w:t>
+      </w:r>
+    </w:p>
+    <w:p>
+      <w:pPr>
+        <w:rPr>
+          <w:rFonts w:ascii="Menlo" w:hAnsi="Menlo" w:cs="Menlo"/>
+          <w:color w:val="E0E0E0"/>
+          <w:kern w:val="0"/>
+          <w:sz w:val="30"/>
+          <w:szCs w:val="30"/>
+        </w:rPr>
+      </w:pPr>
+      <w:proofErr w:type="spellStart"/>
+      <w:r>
+        <w:rPr>
+          <w:rFonts w:ascii="Menlo" w:hAnsi="Menlo" w:cs="Menlo"/>
+          <w:color w:val="E0E0E0"/>
+          <w:kern w:val="0"/>
+          <w:sz w:val="30"/>
+          <w:szCs w:val="30"/>
+        </w:rPr>
+        <w:t>ollama</w:t>
+      </w:r>
+      <w:proofErr w:type="spellEnd"/>
+      <w:r>
+        <w:rPr>
+          <w:rFonts w:ascii="Menlo" w:hAnsi="Menlo" w:cs="Menlo"/>
+          <w:color w:val="E0E0E0"/>
+          <w:kern w:val="0"/>
+          <w:sz w:val="30"/>
+          <w:szCs w:val="30"/>
+        </w:rPr>
+        <w:t xml:space="preserve"> version is 0.18.2</w:t>
+      </w:r>
+    </w:p>
+    <w:p>
+      <w:pPr>
+        <w:rPr>
+          <w:rFonts w:ascii="Menlo" w:hAnsi="Menlo" w:cs="Menlo"/>
+          <w:color w:val="E0E0E0"/>
+          <w:kern w:val="0"/>
+          <w:sz w:val="30"/>
+          <w:szCs w:val="30"/>
+        </w:rPr>
+      </w:pPr>
+    </w:p>
+    <w:p>
+      <w:r>
+        <w:t>On macOS:</w:t>
+      </w:r>
+    </w:p>
+    <w:p>
+      <w:proofErr w:type="spellStart"/>
+      <w:r>
+        <w:t>Ollama</w:t>
+      </w:r>
+      <w:proofErr w:type="spellEnd"/>
+      <w:r>
+        <w:t xml:space="preserve"> typically runs as a background service/daemon</w:t>
+      </w:r>
+    </w:p>
+    <w:p>
+      <w:r>
+        <w:t>Once started, it remains running in the background unless you stop it</w:t>
+      </w:r>
+    </w:p>
+    <w:p>
+      <w:r>
+        <w:t>It listens on http://localhost:11434 by default</w:t>
+      </w:r>
+    </w:p>
+    <w:p>
+      <w:r>
+        <w:t>You can use it immediately without having to manually start it each time (</w:t>
+      </w:r>
+      <w:proofErr w:type="gramStart"/>
+      <w:r>
+        <w:t>as long as</w:t>
+      </w:r>
+      <w:proofErr w:type="gramEnd"/>
+      <w:r>
+        <w:t xml:space="preserve"> the service is active)</w:t>
+      </w:r>
+    </w:p>
+    <w:p>
+      <w:r>
+        <w:t>To check if it is running or not</w:t>
+      </w:r>
+    </w:p>
+    <w:p>
+      <w:pPr>
+        <w:shd w:val="clear" w:color="auto" w:fill="191A1C"/>
+        <w:tabs>
+          <w:tab w:val="left" w:pos="916"/>
+          <w:tab w:val="left" w:pos="1832"/>
+          <w:tab w:val="left" w:pos="2748"/>
+          <w:tab w:val="left" w:pos="3664"/>
+          <w:tab w:val="left" w:pos="4580"/>
+          <w:tab w:val="left" w:pos="5496"/>
+          <w:tab w:val="left" w:pos="6412"/>
+          <w:tab w:val="left" w:pos="7328"/>
+          <w:tab w:val="left" w:pos="8244"/>
+          <w:tab w:val="left" w:pos="9160"/>
+          <w:tab w:val="left" w:pos="10076"/>
+          <w:tab w:val="left" w:pos="10992"/>
+          <w:tab w:val="left" w:pos="11908"/>
+          <w:tab w:val="left" w:pos="12824"/>
+          <w:tab w:val="left" w:pos="13740"/>
+          <w:tab w:val="left" w:pos="14656"/>
+        </w:tabs>
+        <w:spacing w:after="0" w:line="240" w:lineRule="auto"/>
+        <w:rPr>
+          <w:rFonts w:ascii="Inter" w:eastAsia="Times New Roman" w:hAnsi="Inter" w:cs="Courier New"/>
+          <w:color w:val="BCBEC4"/>
+          <w:kern w:val="0"/>
+          <w:sz w:val="20"/>
+          <w:szCs w:val="20"/>
+          <w:lang w:val="sv-SE"/>
+          <w14:ligatures w14:val="none"/>
+        </w:rPr>
+      </w:pPr>
+      <w:r>
+        <w:rPr>
+          <w:rFonts w:ascii="Inter" w:eastAsia="Times New Roman" w:hAnsi="Inter" w:cs="Courier New"/>
+          <w:color w:val="C57633"/>
+          <w:kern w:val="0"/>
+          <w:sz w:val="20"/>
+          <w:szCs w:val="20"/>
+          <w:lang w:val="sv-SE"/>
+          <w14:ligatures w14:val="none"/>
+        </w:rPr>
+        <w:t xml:space="preserve">ps </w:t>
+      </w:r>
+      <w:r>
+        <w:rPr>
+          <w:rFonts w:ascii="Inter" w:eastAsia="Times New Roman" w:hAnsi="Inter" w:cs="Courier New"/>
+          <w:color w:val="BCBEC4"/>
+          <w:kern w:val="0"/>
+          <w:sz w:val="20"/>
+          <w:szCs w:val="20"/>
+          <w:lang w:val="sv-SE"/>
+          <w14:ligatures w14:val="none"/>
+        </w:rPr>
+        <w:t xml:space="preserve">aux | </w:t>
+      </w:r>
+      <w:r>
+        <w:rPr>
+          <w:rFonts w:ascii="Inter" w:eastAsia="Times New Roman" w:hAnsi="Inter" w:cs="Courier New"/>
+          <w:color w:val="C57633"/>
+          <w:kern w:val="0"/>
+          <w:sz w:val="20"/>
+          <w:szCs w:val="20"/>
+          <w:lang w:val="sv-SE"/>
+          <w14:ligatures w14:val="none"/>
+        </w:rPr>
+        <w:t xml:space="preserve">grep </w:t>
+      </w:r>
+      <w:r>
+        <w:rPr>
+          <w:rFonts w:ascii="Inter" w:eastAsia="Times New Roman" w:hAnsi="Inter" w:cs="Courier New"/>
+          <w:color w:val="BCBEC4"/>
+          <w:kern w:val="0"/>
+          <w:sz w:val="20"/>
+          <w:szCs w:val="20"/>
+          <w:lang w:val="sv-SE"/>
+          <w14:ligatures w14:val="none"/>
+        </w:rPr>
+        <w:t xml:space="preserve">-i </w:t>
+      </w:r>
+      <w:proofErr w:type="spellStart"/>
+      <w:r>
+        <w:rPr>
+          <w:rFonts w:ascii="Inter" w:eastAsia="Times New Roman" w:hAnsi="Inter" w:cs="Courier New"/>
+          <w:color w:val="BCBEC4"/>
+          <w:kern w:val="0"/>
+          <w:sz w:val="20"/>
+          <w:szCs w:val="20"/>
+          <w:lang w:val="sv-SE"/>
+          <w14:ligatures w14:val="none"/>
+        </w:rPr>
+        <w:t>ollama</w:t>
+      </w:r>
+      <w:proofErr w:type="spellEnd"/>
+      <w:r>
+        <w:rPr>
+          <w:rFonts w:ascii="Inter" w:eastAsia="Times New Roman" w:hAnsi="Inter" w:cs="Courier New"/>
+          <w:color w:val="BCBEC4"/>
+          <w:kern w:val="0"/>
+          <w:sz w:val="20"/>
+          <w:szCs w:val="20"/>
+          <w:lang w:val="sv-SE"/>
+          <w14:ligatures w14:val="none"/>
+        </w:rPr>
+        <w:t xml:space="preserve"> | </w:t>
+      </w:r>
+      <w:r>
+        <w:rPr>
+          <w:rFonts w:ascii="Inter" w:eastAsia="Times New Roman" w:hAnsi="Inter" w:cs="Courier New"/>
+          <w:color w:val="C57633"/>
+          <w:kern w:val="0"/>
+          <w:sz w:val="20"/>
+          <w:szCs w:val="20"/>
+          <w:lang w:val="sv-SE"/>
+          <w14:ligatures w14:val="none"/>
+        </w:rPr>
+        <w:t xml:space="preserve">grep </w:t>
+      </w:r>
+      <w:r>
+        <w:rPr>
+          <w:rFonts w:ascii="Inter" w:eastAsia="Times New Roman" w:hAnsi="Inter" w:cs="Courier New"/>
+          <w:color w:val="BCBEC4"/>
+          <w:kern w:val="0"/>
+          <w:sz w:val="20"/>
+          <w:szCs w:val="20"/>
+          <w:lang w:val="sv-SE"/>
+          <w14:ligatures w14:val="none"/>
+        </w:rPr>
+        <w:t>-v grep</w:t>
+      </w:r>
+    </w:p>
+    <w:p>
+      <w:pPr>
+        <w:rPr>
+          <w:lang w:val="sv-SE"/>
+        </w:rPr>
+      </w:pPr>
+    </w:p>
+    <w:p>
+      <w:pPr>
+        <w:pStyle w:val="HTMLPreformatted"/>
+        <w:shd w:val="clear" w:color="auto" w:fill="191A1C"/>
+        <w:rPr>
+          <w:color w:val="BCBEC4"/>
+        </w:rPr>
+      </w:pPr>
+      <w:r>
+        <w:rPr>
+          <w:color w:val="7A7E85"/>
+        </w:rPr>
+        <w:lastRenderedPageBreak/>
+        <w:t xml:space="preserve"># Start </w:t>
+      </w:r>
+      <w:proofErr w:type="spellStart"/>
+      <w:r>
+        <w:rPr>
+          <w:color w:val="7A7E85"/>
+        </w:rPr>
+        <w:t>ollama</w:t>
+      </w:r>
+      <w:proofErr w:type="spellEnd"/>
+      <w:r>
+        <w:rPr>
+          <w:color w:val="7A7E85"/>
+        </w:rPr>
+        <w:t xml:space="preserve"> (if not running)</w:t>
+      </w:r>
+      <w:r>
+        <w:rPr>
+          <w:color w:val="7A7E85"/>
+        </w:rPr>
+        <w:br/>
+      </w:r>
+      <w:proofErr w:type="spellStart"/>
+      <w:r>
+        <w:rPr>
+          <w:color w:val="C57633"/>
+        </w:rPr>
+        <w:t>ollama</w:t>
+      </w:r>
+      <w:proofErr w:type="spellEnd"/>
+      <w:r>
+        <w:rPr>
+          <w:color w:val="C57633"/>
+        </w:rPr>
+        <w:t xml:space="preserve"> </w:t>
+      </w:r>
+      <w:r>
+        <w:rPr>
+          <w:color w:val="BCBEC4"/>
+        </w:rPr>
+        <w:t>serve</w:t>
+      </w:r>
+      <w:r>
+        <w:rPr>
+          <w:color w:val="BCBEC4"/>
+        </w:rPr>
+        <w:br/>
+      </w:r>
+      <w:r>
+        <w:rPr>
+          <w:color w:val="BCBEC4"/>
+        </w:rPr>
+        <w:br/>
+      </w:r>
+      <w:r>
+        <w:rPr>
+          <w:color w:val="7A7E85"/>
+        </w:rPr>
+        <w:t># Or if installed via Homebrew on macOS, it may auto-start as a service</w:t>
+      </w:r>
+      <w:r>
+        <w:rPr>
+          <w:color w:val="7A7E85"/>
+        </w:rPr>
+        <w:br/>
+        <w:t># To check status or restart:</w:t>
+      </w:r>
+      <w:r>
+        <w:rPr>
+          <w:color w:val="7A7E85"/>
+        </w:rPr>
+        <w:br/>
+      </w:r>
+      <w:r>
+        <w:rPr>
+          <w:color w:val="C57633"/>
+        </w:rPr>
+        <w:t xml:space="preserve">brew </w:t>
+      </w:r>
+      <w:r>
+        <w:rPr>
+          <w:color w:val="BCBEC4"/>
+        </w:rPr>
+        <w:t xml:space="preserve">services restart </w:t>
+      </w:r>
+      <w:proofErr w:type="spellStart"/>
+      <w:proofErr w:type="gramStart"/>
+      <w:r>
+        <w:rPr>
+          <w:color w:val="BCBEC4"/>
+        </w:rPr>
+        <w:t>ollama</w:t>
+      </w:r>
+      <w:proofErr w:type="spellEnd"/>
+      <w:r>
+        <w:rPr>
+          <w:color w:val="BCBEC4"/>
+        </w:rPr>
+        <w:t xml:space="preserve">  </w:t>
+      </w:r>
+      <w:r>
+        <w:rPr>
+          <w:color w:val="7A7E85"/>
+        </w:rPr>
+        <w:t>#</w:t>
+      </w:r>
+      <w:proofErr w:type="gramEnd"/>
+      <w:r>
+        <w:rPr>
+          <w:color w:val="7A7E85"/>
+        </w:rPr>
+        <w:t xml:space="preserve"> if installed via Homebrew</w:t>
+      </w:r>
+    </w:p>
+    <w:p/>
+    <w:p>
+      <w:r>
+        <w:t xml:space="preserve">Here are the ways to stop </w:t>
+      </w:r>
+      <w:proofErr w:type="spellStart"/>
+      <w:r>
+        <w:t>ollama</w:t>
+      </w:r>
+      <w:proofErr w:type="spellEnd"/>
+      <w:r>
+        <w:t>:</w:t>
+      </w:r>
+    </w:p>
+    <w:p>
+      <w:r>
+        <w:t>Option 1: Using Homebrew (recommended on macOS)</w:t>
+      </w:r>
+    </w:p>
+    <w:p>
+      <w:pPr>
+        <w:pStyle w:val="HTMLPreformatted"/>
+        <w:shd w:val="clear" w:color="auto" w:fill="191A1C"/>
+        <w:rPr>
+          <w:color w:val="BCBEC4"/>
+        </w:rPr>
+      </w:pPr>
+      <w:r>
+        <w:rPr>
+          <w:color w:val="C57633"/>
+        </w:rPr>
+        <w:t xml:space="preserve">brew </w:t>
+      </w:r>
+      <w:r>
+        <w:rPr>
+          <w:color w:val="BCBEC4"/>
+        </w:rPr>
+        <w:t xml:space="preserve">services stop </w:t>
+      </w:r>
+      <w:proofErr w:type="spellStart"/>
+      <w:r>
+        <w:rPr>
+          <w:color w:val="BCBEC4"/>
+        </w:rPr>
+        <w:t>ollama</w:t>
+      </w:r>
+      <w:proofErr w:type="spellEnd"/>
+    </w:p>
+    <w:p/>
+    <w:p>
+      <w:r>
+        <w:t>Option 2: Kill the process directly</w:t>
+      </w:r>
+    </w:p>
+    <w:p>
+      <w:pPr>
+        <w:pStyle w:val="HTMLPreformatted"/>
+        <w:shd w:val="clear" w:color="auto" w:fill="191A1C"/>
+        <w:rPr>
+          <w:color w:val="BCBEC4"/>
+        </w:rPr>
+      </w:pPr>
+      <w:r>
+        <w:rPr>
+          <w:color w:val="C57633"/>
+        </w:rPr>
+        <w:t xml:space="preserve">kill </w:t>
+      </w:r>
+      <w:proofErr w:type="gramStart"/>
+      <w:r>
+        <w:rPr>
+          <w:color w:val="2AACB8"/>
+        </w:rPr>
+        <w:t xml:space="preserve">42520  </w:t>
+      </w:r>
+      <w:r>
+        <w:rPr>
+          <w:color w:val="7A7E85"/>
+        </w:rPr>
+        <w:t>#</w:t>
+      </w:r>
+      <w:proofErr w:type="gramEnd"/>
+      <w:r>
+        <w:rPr>
+          <w:color w:val="7A7E85"/>
+        </w:rPr>
+        <w:t xml:space="preserve"> Using the PID we found earlier</w:t>
+      </w:r>
+      <w:r>
+        <w:rPr>
+          <w:color w:val="7A7E85"/>
+        </w:rPr>
+        <w:br/>
+        <w:t xml:space="preserve"># Or kill all </w:t>
+      </w:r>
+      <w:proofErr w:type="spellStart"/>
+      <w:r>
+        <w:rPr>
+          <w:color w:val="7A7E85"/>
+        </w:rPr>
+        <w:t>ollama</w:t>
+      </w:r>
+      <w:proofErr w:type="spellEnd"/>
+      <w:r>
+        <w:rPr>
+          <w:color w:val="7A7E85"/>
+        </w:rPr>
+        <w:t xml:space="preserve"> processes:</w:t>
+      </w:r>
+      <w:r>
+        <w:rPr>
+          <w:color w:val="7A7E85"/>
+        </w:rPr>
+        <w:br/>
+      </w:r>
+      <w:proofErr w:type="spellStart"/>
+      <w:r>
+        <w:rPr>
+          <w:color w:val="C57633"/>
+        </w:rPr>
+        <w:t>killall</w:t>
+      </w:r>
+      <w:proofErr w:type="spellEnd"/>
+      <w:r>
+        <w:rPr>
+          <w:color w:val="C57633"/>
+        </w:rPr>
+        <w:t xml:space="preserve"> </w:t>
+      </w:r>
+      <w:proofErr w:type="spellStart"/>
+      <w:r>
+        <w:rPr>
+          <w:color w:val="BCBEC4"/>
+        </w:rPr>
+        <w:t>ollama</w:t>
+      </w:r>
+      <w:proofErr w:type="spellEnd"/>
+    </w:p>
+    <w:p/>
+    <w:p>
+      <w:r>
+        <w:t xml:space="preserve">Option 3: If </w:t>
+      </w:r>
+      <w:proofErr w:type="spellStart"/>
+      <w:r>
+        <w:t>ollama</w:t>
+      </w:r>
+      <w:proofErr w:type="spellEnd"/>
+      <w:r>
+        <w:t xml:space="preserve"> is running in a terminal foreground</w:t>
+      </w:r>
+    </w:p>
+    <w:p>
+      <w:pPr>
+        <w:pStyle w:val="HTMLPreformatted"/>
+        <w:shd w:val="clear" w:color="auto" w:fill="191A1C"/>
+        <w:rPr>
+          <w:color w:val="BCBEC4"/>
+        </w:rPr>
+      </w:pPr>
+      <w:proofErr w:type="spellStart"/>
+      <w:r>
+        <w:rPr>
+          <w:color w:val="C57633"/>
+        </w:rPr>
+        <w:t>Ctrl+</w:t>
+      </w:r>
+      <w:proofErr w:type="gramStart"/>
+      <w:r>
+        <w:rPr>
+          <w:color w:val="C57633"/>
+        </w:rPr>
+        <w:t>C</w:t>
+      </w:r>
+      <w:proofErr w:type="spellEnd"/>
+      <w:r>
+        <w:rPr>
+          <w:color w:val="C57633"/>
+        </w:rPr>
+        <w:t xml:space="preserve">  </w:t>
+      </w:r>
+      <w:r>
+        <w:rPr>
+          <w:color w:val="7A7E85"/>
+        </w:rPr>
+        <w:t>#</w:t>
+      </w:r>
+      <w:proofErr w:type="gramEnd"/>
+      <w:r>
+        <w:rPr>
+          <w:color w:val="7A7E85"/>
+        </w:rPr>
+        <w:t xml:space="preserve"> Press </w:t>
+      </w:r>
+      <w:proofErr w:type="spellStart"/>
+      <w:r>
+        <w:rPr>
+          <w:color w:val="7A7E85"/>
+        </w:rPr>
+        <w:t>Control+C</w:t>
+      </w:r>
+      <w:proofErr w:type="spellEnd"/>
+      <w:r>
+        <w:rPr>
+          <w:color w:val="7A7E85"/>
+        </w:rPr>
+        <w:t xml:space="preserve"> to stop it</w:t>
+      </w:r>
+    </w:p>
+    <w:p/>
+    <w:p>
+      <w:r>
+        <w:t>To check if it's stopped:</w:t>
+      </w:r>
+    </w:p>
+    <w:p>
+      <w:pPr>
+        <w:pStyle w:val="HTMLPreformatted"/>
+        <w:shd w:val="clear" w:color="auto" w:fill="191A1C"/>
+        <w:rPr>
+          <w:color w:val="BCBEC4"/>
+        </w:rPr>
+      </w:pPr>
+      <w:proofErr w:type="spellStart"/>
+      <w:r>
+        <w:rPr>
+          <w:color w:val="C57633"/>
+        </w:rPr>
+        <w:t>ps</w:t>
+      </w:r>
+      <w:proofErr w:type="spellEnd"/>
+      <w:r>
+        <w:rPr>
+          <w:color w:val="C57633"/>
+        </w:rPr>
+        <w:t xml:space="preserve"> </w:t>
+      </w:r>
+      <w:r>
+        <w:rPr>
+          <w:color w:val="BCBEC4"/>
+        </w:rPr>
+        <w:t xml:space="preserve">aux | </w:t>
+      </w:r>
+      <w:r>
+        <w:rPr>
+          <w:color w:val="C57633"/>
+        </w:rPr>
+        <w:t xml:space="preserve">grep </w:t>
+      </w:r>
+      <w:r>
+        <w:rPr>
+          <w:color w:val="BCBEC4"/>
+        </w:rPr>
+        <w:t>-</w:t>
+      </w:r>
+      <w:proofErr w:type="spellStart"/>
+      <w:r>
+        <w:rPr>
+          <w:color w:val="BCBEC4"/>
+        </w:rPr>
+        <w:t>i</w:t>
+      </w:r>
+      <w:proofErr w:type="spellEnd"/>
+      <w:r>
+        <w:rPr>
+          <w:color w:val="BCBEC4"/>
+        </w:rPr>
+        <w:t xml:space="preserve"> </w:t>
+      </w:r>
+      <w:proofErr w:type="spellStart"/>
+      <w:r>
+        <w:rPr>
+          <w:color w:val="BCBEC4"/>
+        </w:rPr>
+        <w:t>ollama</w:t>
+      </w:r>
+      <w:proofErr w:type="spellEnd"/>
+      <w:r>
+        <w:rPr>
+          <w:color w:val="BCBEC4"/>
+        </w:rPr>
+        <w:t xml:space="preserve"> | </w:t>
+      </w:r>
+      <w:r>
+        <w:rPr>
+          <w:color w:val="C57633"/>
+        </w:rPr>
+        <w:t xml:space="preserve">grep </w:t>
+      </w:r>
+      <w:r>
+        <w:rPr>
+          <w:color w:val="BCBEC4"/>
+        </w:rPr>
+        <w:t>-v grep</w:t>
+      </w:r>
+      <w:r>
+        <w:rPr>
+          <w:color w:val="BCBEC4"/>
+        </w:rPr>
+        <w:br/>
+      </w:r>
+      <w:r>
+        <w:rPr>
+          <w:color w:val="7A7E85"/>
+        </w:rPr>
+        <w:t xml:space="preserve"># If nothing appears, </w:t>
+      </w:r>
+      <w:proofErr w:type="spellStart"/>
+      <w:r>
+        <w:rPr>
+          <w:color w:val="7A7E85"/>
+        </w:rPr>
+        <w:t>ollama</w:t>
+      </w:r>
+      <w:proofErr w:type="spellEnd"/>
+      <w:r>
+        <w:rPr>
+          <w:color w:val="7A7E85"/>
+        </w:rPr>
+        <w:t xml:space="preserve"> is stopped</w:t>
+      </w:r>
+    </w:p>
+    <w:p/>
+    <w:p>
+      <w:r>
+        <w:t xml:space="preserve">To restart </w:t>
+      </w:r>
+      <w:proofErr w:type="spellStart"/>
+      <w:r>
+        <w:t>ollama</w:t>
+      </w:r>
+      <w:proofErr w:type="spellEnd"/>
+      <w:r>
+        <w:t xml:space="preserve"> later:</w:t>
+      </w:r>
+    </w:p>
+    <w:p>
+      <w:pPr>
+        <w:pStyle w:val="HTMLPreformatted"/>
+        <w:shd w:val="clear" w:color="auto" w:fill="191A1C"/>
+        <w:rPr>
+          <w:color w:val="BCBEC4"/>
+        </w:rPr>
+      </w:pPr>
+      <w:r>
+        <w:rPr>
+          <w:color w:val="C57633"/>
+        </w:rPr>
+        <w:t xml:space="preserve">brew </w:t>
+      </w:r>
+      <w:r>
+        <w:rPr>
+          <w:color w:val="BCBEC4"/>
+        </w:rPr>
+        <w:t xml:space="preserve">services start </w:t>
+      </w:r>
+      <w:proofErr w:type="spellStart"/>
+      <w:r>
+        <w:rPr>
+          <w:color w:val="BCBEC4"/>
+        </w:rPr>
+        <w:t>ollama</w:t>
+      </w:r>
+      <w:proofErr w:type="spellEnd"/>
+      <w:r>
+        <w:rPr>
+          <w:color w:val="BCBEC4"/>
+        </w:rPr>
+        <w:br/>
+      </w:r>
+      <w:r>
+        <w:rPr>
+          <w:color w:val="7A7E85"/>
+        </w:rPr>
+        <w:t># Or manually:</w:t>
+      </w:r>
+      <w:r>
+        <w:rPr>
+          <w:color w:val="7A7E85"/>
+        </w:rPr>
+        <w:br/>
+      </w:r>
+      <w:proofErr w:type="spellStart"/>
+      <w:r>
+        <w:rPr>
+          <w:color w:val="C57633"/>
+        </w:rPr>
+        <w:t>ollama</w:t>
+      </w:r>
+      <w:proofErr w:type="spellEnd"/>
+      <w:r>
+        <w:rPr>
+          <w:color w:val="C57633"/>
+        </w:rPr>
+        <w:t xml:space="preserve"> </w:t>
+      </w:r>
+      <w:r>
+        <w:rPr>
+          <w:color w:val="BCBEC4"/>
+        </w:rPr>
+        <w:t>serve</w:t>
+      </w:r>
+    </w:p>
+    <w:p/>
+    <w:p>
+      <w:r>
+        <w:t xml:space="preserve">Since you're on macOS and </w:t>
+      </w:r>
+      <w:proofErr w:type="spellStart"/>
+      <w:r>
+        <w:t>ollama</w:t>
+      </w:r>
+      <w:proofErr w:type="spellEnd"/>
+      <w:r>
+        <w:t xml:space="preserve"> is likely installed via Homebrew, I'd recommend using brew services stop </w:t>
+      </w:r>
+      <w:proofErr w:type="spellStart"/>
+      <w:r>
+        <w:t>ollama</w:t>
+      </w:r>
+      <w:proofErr w:type="spellEnd"/>
+      <w:r>
+        <w:t xml:space="preserve"> to stop it properly. Let me know if you need anything else!</w:t>
+      </w:r>
+    </w:p>
+    <w:p/>
     <w:p/>
     <w:sectPr>
       <w:pgSz w:w="12240" w:h="15840"/>
@@ -1123,6 +2207,58 @@
       <w:spacing w:val="5"/>
     </w:rPr>
   </w:style>
+  <w:style w:type="paragraph" w:styleId="HTMLPreformatted">
+    <w:name w:val="HTML Preformatted"/>
+    <w:basedOn w:val="Normal"/>
+    <w:link w:val="HTMLPreformattedChar"/>
+    <w:uiPriority w:val="99"/>
+    <w:semiHidden/>
+    <w:unhideWhenUsed/>
+    <w:rsid w:val="00901B4B"/>
+    <w:pPr>
+      <w:tabs>
+        <w:tab w:val="left" w:pos="916"/>
+        <w:tab w:val="left" w:pos="1832"/>
+        <w:tab w:val="left" w:pos="2748"/>
+        <w:tab w:val="left" w:pos="3664"/>
+        <w:tab w:val="left" w:pos="4580"/>
+        <w:tab w:val="left" w:pos="5496"/>
+        <w:tab w:val="left" w:pos="6412"/>
+        <w:tab w:val="left" w:pos="7328"/>
+        <w:tab w:val="left" w:pos="8244"/>
+        <w:tab w:val="left" w:pos="9160"/>
+        <w:tab w:val="left" w:pos="10076"/>
+        <w:tab w:val="left" w:pos="10992"/>
+        <w:tab w:val="left" w:pos="11908"/>
+        <w:tab w:val="left" w:pos="12824"/>
+        <w:tab w:val="left" w:pos="13740"/>
+        <w:tab w:val="left" w:pos="14656"/>
+      </w:tabs>
+      <w:spacing w:after="0" w:line="240" w:lineRule="auto"/>
+    </w:pPr>
+    <w:rPr>
+      <w:rFonts w:ascii="Courier New" w:eastAsia="Times New Roman" w:hAnsi="Courier New" w:cs="Courier New"/>
+      <w:kern w:val="0"/>
+      <w:sz w:val="20"/>
+      <w:szCs w:val="20"/>
+      <w14:ligatures w14:val="none"/>
+    </w:rPr>
+  </w:style>
+  <w:style w:type="character" w:customStyle="1" w:styleId="HTMLPreformattedChar">
+    <w:name w:val="HTML Preformatted Char"/>
+    <w:basedOn w:val="DefaultParagraphFont"/>
+    <w:link w:val="HTMLPreformatted"/>
+    <w:uiPriority w:val="99"/>
+    <w:semiHidden/>
+    <w:rsid w:val="00901B4B"/>
+    <w:rPr>
+      <w:rFonts w:ascii="Courier New" w:eastAsia="Times New Roman" w:hAnsi="Courier New" w:cs="Courier New"/>
+      <w:kern w:val="0"/>
+      <w:sz w:val="20"/>
+      <w:szCs w:val="20"/>
+      <w14:ligatures w14:val="none"/>
+    </w:rPr>
+  </w:style>
 </w:styles>
 </file>
 

</xml_diff>